<commit_message>
Update add new files doc
</commit_message>
<xml_diff>
--- a/Instructions on adding new files.docx
+++ b/Instructions on adding new files.docx
@@ -4,7 +4,7 @@
   <w:body>
     <w:p>
       <w:pPr>
-        <w:pStyle w:val="Heading2"/>
+        <w:pStyle w:val="berschrift2"/>
         <w:rPr>
           <w:lang w:val="en-GB"/>
         </w:rPr>
@@ -32,7 +32,7 @@
     </w:p>
     <w:p>
       <w:pPr>
-        <w:pStyle w:val="ListParagraph"/>
+        <w:pStyle w:val="Listenabsatz"/>
         <w:numPr>
           <w:ilvl w:val="0"/>
           <w:numId w:val="1"/>
@@ -70,7 +70,7 @@
     </w:p>
     <w:p>
       <w:pPr>
-        <w:pStyle w:val="ListParagraph"/>
+        <w:pStyle w:val="Listenabsatz"/>
         <w:numPr>
           <w:ilvl w:val="0"/>
           <w:numId w:val="1"/>
@@ -100,7 +100,7 @@
     </w:p>
     <w:p>
       <w:pPr>
-        <w:pStyle w:val="ListParagraph"/>
+        <w:pStyle w:val="Listenabsatz"/>
         <w:numPr>
           <w:ilvl w:val="1"/>
           <w:numId w:val="1"/>
@@ -113,7 +113,14 @@
         <w:rPr>
           <w:lang w:val="en-GB"/>
         </w:rPr>
-        <w:t xml:space="preserve">Make sure that the R files contain Roxygen2 notes (see below). In particular </w:t>
+        <w:t xml:space="preserve">Make sure that the R files contain Roxygen2 notes (see below). </w:t>
+      </w:r>
+      <w:proofErr w:type="gramStart"/>
+      <w:r>
+        <w:rPr>
+          <w:lang w:val="en-GB"/>
+        </w:rPr>
+        <w:t xml:space="preserve">In particular </w:t>
       </w:r>
       <w:r>
         <w:rPr>
@@ -123,6 +130,7 @@
         </w:rPr>
         <w:t>@</w:t>
       </w:r>
+      <w:proofErr w:type="gramEnd"/>
       <w:r>
         <w:rPr>
           <w:b/>
@@ -140,7 +148,7 @@
     </w:p>
     <w:p>
       <w:pPr>
-        <w:pStyle w:val="ListParagraph"/>
+        <w:pStyle w:val="Listenabsatz"/>
         <w:numPr>
           <w:ilvl w:val="1"/>
           <w:numId w:val="1"/>
@@ -153,16 +161,38 @@
         <w:rPr>
           <w:lang w:val="en-GB"/>
         </w:rPr>
-        <w:t xml:space="preserve">Note that multiple R functions can be included in a single document as long as they all have an export function (see for example </w:t>
+        <w:t xml:space="preserve">Note that multiple R functions can be included in a single document </w:t>
+      </w:r>
+      <w:proofErr w:type="gramStart"/>
+      <w:r>
+        <w:rPr>
+          <w:lang w:val="en-GB"/>
+        </w:rPr>
+        <w:t>as long as</w:t>
+      </w:r>
+      <w:proofErr w:type="gramEnd"/>
+      <w:r>
+        <w:rPr>
+          <w:lang w:val="en-GB"/>
+        </w:rPr>
+        <w:t xml:space="preserve"> they all have an export function (see for example </w:t>
       </w:r>
       <w:proofErr w:type="spellStart"/>
       <w:r>
         <w:rPr>
           <w:lang w:val="en-GB"/>
         </w:rPr>
-        <w:t>common_plotting_functions.R</w:t>
+        <w:t>common_plotting_</w:t>
+      </w:r>
+      <w:proofErr w:type="gramStart"/>
+      <w:r>
+        <w:rPr>
+          <w:lang w:val="en-GB"/>
+        </w:rPr>
+        <w:t>functions.R</w:t>
       </w:r>
       <w:proofErr w:type="spellEnd"/>
+      <w:proofErr w:type="gramEnd"/>
       <w:r>
         <w:rPr>
           <w:lang w:val="en-GB"/>
@@ -172,7 +202,7 @@
     </w:p>
     <w:p>
       <w:pPr>
-        <w:pStyle w:val="ListParagraph"/>
+        <w:pStyle w:val="Listenabsatz"/>
         <w:numPr>
           <w:ilvl w:val="0"/>
           <w:numId w:val="1"/>
@@ -204,7 +234,7 @@
     </w:p>
     <w:p>
       <w:pPr>
-        <w:pStyle w:val="ListParagraph"/>
+        <w:pStyle w:val="Listenabsatz"/>
         <w:numPr>
           <w:ilvl w:val="0"/>
           <w:numId w:val="1"/>
@@ -256,7 +286,7 @@
     </w:p>
     <w:p>
       <w:pPr>
-        <w:pStyle w:val="ListParagraph"/>
+        <w:pStyle w:val="Listenabsatz"/>
         <w:numPr>
           <w:ilvl w:val="0"/>
           <w:numId w:val="1"/>
@@ -269,44 +299,35 @@
         <w:rPr>
           <w:lang w:val="en-GB"/>
         </w:rPr>
-        <w:t>E</w:t>
-      </w:r>
-      <w:r>
-        <w:rPr>
-          <w:lang w:val="en-GB"/>
-        </w:rPr>
-        <w:t xml:space="preserve">nter </w:t>
-      </w:r>
-      <w:r>
-        <w:rPr>
-          <w:lang w:val="en-GB"/>
-        </w:rPr>
-        <w:t>roxygen2::</w:t>
+        <w:t xml:space="preserve">Call </w:t>
+      </w:r>
+      <w:r>
+        <w:rPr>
+          <w:b/>
+          <w:lang w:val="en-GB"/>
+        </w:rPr>
+        <w:t>library(</w:t>
       </w:r>
       <w:proofErr w:type="spellStart"/>
       <w:r>
         <w:rPr>
-          <w:lang w:val="en-GB"/>
-        </w:rPr>
-        <w:t>roxygenise</w:t>
+          <w:b/>
+          <w:lang w:val="en-GB"/>
+        </w:rPr>
+        <w:t>devtools</w:t>
       </w:r>
       <w:proofErr w:type="spellEnd"/>
       <w:r>
         <w:rPr>
-          <w:lang w:val="en-GB"/>
-        </w:rPr>
-        <w:t>()</w:t>
-      </w:r>
-      <w:r>
-        <w:rPr>
-          <w:lang w:val="en-GB"/>
-        </w:rPr>
-        <w:t xml:space="preserve"> (this will build the new NAMESPACE document) </w:t>
+          <w:b/>
+          <w:lang w:val="en-GB"/>
+        </w:rPr>
+        <w:t>)</w:t>
       </w:r>
     </w:p>
     <w:p>
       <w:pPr>
-        <w:pStyle w:val="ListParagraph"/>
+        <w:pStyle w:val="Listenabsatz"/>
         <w:numPr>
           <w:ilvl w:val="0"/>
           <w:numId w:val="1"/>
@@ -319,18 +340,134 @@
         <w:rPr>
           <w:lang w:val="en-GB"/>
         </w:rPr>
-        <w:t>Commit</w:t>
-      </w:r>
-      <w:r>
-        <w:rPr>
-          <w:lang w:val="en-GB"/>
-        </w:rPr>
-        <w:t xml:space="preserve"> &amp; push </w:t>
+        <w:t xml:space="preserve">Call </w:t>
+      </w:r>
+      <w:r>
+        <w:rPr>
+          <w:b/>
+          <w:lang w:val="en-GB"/>
+        </w:rPr>
+        <w:t>roxygen</w:t>
+      </w:r>
+      <w:proofErr w:type="gramStart"/>
+      <w:r>
+        <w:rPr>
+          <w:b/>
+          <w:lang w:val="en-GB"/>
+        </w:rPr>
+        <w:t>2::</w:t>
+      </w:r>
+      <w:proofErr w:type="spellStart"/>
+      <w:r>
+        <w:rPr>
+          <w:b/>
+          <w:lang w:val="en-GB"/>
+        </w:rPr>
+        <w:t>roxygenise</w:t>
+      </w:r>
+      <w:proofErr w:type="spellEnd"/>
+      <w:r>
+        <w:rPr>
+          <w:b/>
+          <w:lang w:val="en-GB"/>
+        </w:rPr>
+        <w:t>(</w:t>
+      </w:r>
+      <w:proofErr w:type="gramEnd"/>
+      <w:r>
+        <w:rPr>
+          <w:b/>
+          <w:lang w:val="en-GB"/>
+        </w:rPr>
+        <w:t>)</w:t>
+      </w:r>
+      <w:r>
+        <w:rPr>
+          <w:b/>
+          <w:lang w:val="en-GB"/>
+        </w:rPr>
+        <w:t xml:space="preserve"> </w:t>
+      </w:r>
+      <w:r>
+        <w:rPr>
+          <w:lang w:val="en-GB"/>
+        </w:rPr>
+        <w:t>(</w:t>
+      </w:r>
+      <w:r>
+        <w:rPr>
+          <w:lang w:val="en-GB"/>
+        </w:rPr>
+        <w:t xml:space="preserve">this will build the new NAMESPACE document) </w:t>
       </w:r>
     </w:p>
     <w:p>
       <w:pPr>
-        <w:pStyle w:val="Heading2"/>
+        <w:pStyle w:val="Listenabsatz"/>
+        <w:numPr>
+          <w:ilvl w:val="0"/>
+          <w:numId w:val="1"/>
+        </w:numPr>
+        <w:rPr>
+          <w:lang w:val="en-GB"/>
+        </w:rPr>
+      </w:pPr>
+      <w:r>
+        <w:rPr>
+          <w:lang w:val="en-GB"/>
+        </w:rPr>
+        <w:t xml:space="preserve">Call </w:t>
+      </w:r>
+      <w:proofErr w:type="gramStart"/>
+      <w:r>
+        <w:rPr>
+          <w:b/>
+          <w:lang w:val="en-GB"/>
+        </w:rPr>
+        <w:t>document(</w:t>
+      </w:r>
+      <w:proofErr w:type="gramEnd"/>
+      <w:r>
+        <w:rPr>
+          <w:b/>
+          <w:lang w:val="en-GB"/>
+        </w:rPr>
+        <w:t>)</w:t>
+      </w:r>
+      <w:r>
+        <w:rPr>
+          <w:lang w:val="en-GB"/>
+        </w:rPr>
+        <w:t xml:space="preserve"> (this will update the documentation documents)</w:t>
+      </w:r>
+    </w:p>
+    <w:p>
+      <w:pPr>
+        <w:pStyle w:val="Listenabsatz"/>
+        <w:numPr>
+          <w:ilvl w:val="0"/>
+          <w:numId w:val="1"/>
+        </w:numPr>
+        <w:rPr>
+          <w:lang w:val="en-GB"/>
+        </w:rPr>
+      </w:pPr>
+      <w:r>
+        <w:rPr>
+          <w:lang w:val="en-GB"/>
+        </w:rPr>
+        <w:t>Commit</w:t>
+      </w:r>
+      <w:r>
+        <w:rPr>
+          <w:lang w:val="en-GB"/>
+        </w:rPr>
+        <w:t xml:space="preserve"> &amp; push </w:t>
+      </w:r>
+    </w:p>
+    <w:p>
+      <w:pPr>
+        <w:pStyle w:val="berschrift2"/>
         <w:rPr>
           <w:b/>
           <w:bCs/>
@@ -381,7 +518,7 @@
     </w:p>
     <w:p>
       <w:pPr>
-        <w:pStyle w:val="Heading3"/>
+        <w:pStyle w:val="berschrift3"/>
         <w:rPr>
           <w:lang w:val="en-GB"/>
         </w:rPr>
@@ -449,6 +586,7 @@
         </w:rPr>
         <w:t>returned_variable1</w:t>
       </w:r>
+      <w:proofErr w:type="gramStart"/>
       <w:r>
         <w:rPr>
           <w:lang w:val="en-GB"/>
@@ -459,7 +597,28 @@
         <w:rPr>
           <w:lang w:val="en-GB"/>
         </w:rPr>
-        <w:t xml:space="preserve">: description   (the * should make it a </w:t>
+        <w:t>:</w:t>
+      </w:r>
+      <w:proofErr w:type="gramEnd"/>
+      <w:r>
+        <w:rPr>
+          <w:lang w:val="en-GB"/>
+        </w:rPr>
+        <w:t xml:space="preserve"> description</w:t>
+      </w:r>
+      <w:proofErr w:type="gramStart"/>
+      <w:r>
+        <w:rPr>
+          <w:lang w:val="en-GB"/>
+        </w:rPr>
+        <w:t xml:space="preserve">   (</w:t>
+      </w:r>
+      <w:proofErr w:type="gramEnd"/>
+      <w:r>
+        <w:rPr>
+          <w:lang w:val="en-GB"/>
+        </w:rPr>
+        <w:t xml:space="preserve">the * should make it a </w:t>
       </w:r>
       <w:proofErr w:type="spellStart"/>
       <w:r>
@@ -494,6 +653,7 @@
         </w:rPr>
         <w:t>returned_variable2</w:t>
       </w:r>
+      <w:proofErr w:type="gramStart"/>
       <w:r>
         <w:rPr>
           <w:lang w:val="en-GB"/>
@@ -506,6 +666,7 @@
         </w:rPr>
         <w:t>:</w:t>
       </w:r>
+      <w:proofErr w:type="gramEnd"/>
       <w:r>
         <w:rPr>
           <w:lang w:val="en-GB"/>
@@ -545,44 +706,60 @@
         </w:rPr>
         <w:t xml:space="preserve"> ungroup</w:t>
       </w:r>
-      <w:r>
-        <w:rPr>
-          <w:lang w:val="en-GB"/>
-        </w:rPr>
-        <w:t xml:space="preserve">   (imports specific function from package </w:t>
+      <w:proofErr w:type="gramStart"/>
+      <w:r>
+        <w:rPr>
+          <w:lang w:val="en-GB"/>
+        </w:rPr>
+        <w:t xml:space="preserve">   (</w:t>
+      </w:r>
+      <w:proofErr w:type="gramEnd"/>
+      <w:r>
+        <w:rPr>
+          <w:lang w:val="en-GB"/>
+        </w:rPr>
+        <w:t xml:space="preserve">imports specific function from package </w:t>
       </w:r>
     </w:p>
     <w:p>
       <w:pPr>
         <w:rPr>
-          <w:lang w:val="en-GB"/>
-        </w:rPr>
-      </w:pPr>
-      <w:r>
-        <w:rPr>
-          <w:lang w:val="en-GB"/>
-        </w:rPr>
-        <w:t>#' @import</w:t>
-      </w:r>
-      <w:r>
-        <w:rPr>
-          <w:lang w:val="en-GB"/>
-        </w:rPr>
-        <w:t xml:space="preserve"> </w:t>
+          <w:lang w:val="fr-FR"/>
+        </w:rPr>
+      </w:pPr>
+      <w:r>
+        <w:rPr>
+          <w:lang w:val="fr-FR"/>
+        </w:rPr>
+        <w:t xml:space="preserve">#' @import </w:t>
       </w:r>
       <w:proofErr w:type="spellStart"/>
       <w:r>
         <w:rPr>
-          <w:lang w:val="en-GB"/>
+          <w:lang w:val="fr-FR"/>
         </w:rPr>
         <w:t>dplyr</w:t>
       </w:r>
       <w:proofErr w:type="spellEnd"/>
       <w:r>
         <w:rPr>
-          <w:lang w:val="en-GB"/>
-        </w:rPr>
-        <w:t xml:space="preserve"> (imports entire package) </w:t>
+          <w:lang w:val="fr-FR"/>
+        </w:rPr>
+        <w:t xml:space="preserve"> (imports </w:t>
+      </w:r>
+      <w:proofErr w:type="spellStart"/>
+      <w:r>
+        <w:rPr>
+          <w:lang w:val="fr-FR"/>
+        </w:rPr>
+        <w:t>entire</w:t>
+      </w:r>
+      <w:proofErr w:type="spellEnd"/>
+      <w:r>
+        <w:rPr>
+          <w:lang w:val="fr-FR"/>
+        </w:rPr>
+        <w:t xml:space="preserve"> package) </w:t>
       </w:r>
     </w:p>
     <w:p>
@@ -983,6 +1160,7 @@
               <w:rPr>
                 <w:lang w:val="en-GB"/>
               </w:rPr>
+              <w:lastRenderedPageBreak/>
               <w:t>@seealso</w:t>
             </w:r>
           </w:p>
@@ -1591,15 +1769,15 @@
     <w:lsdException w:name="Unresolved Mention" w:semiHidden="1" w:unhideWhenUsed="1"/>
     <w:lsdException w:name="Smart Link" w:semiHidden="1" w:unhideWhenUsed="1"/>
   </w:latentStyles>
-  <w:style w:type="paragraph" w:default="1" w:styleId="Normal">
+  <w:style w:type="paragraph" w:default="1" w:styleId="Standard">
     <w:name w:val="Normal"/>
     <w:qFormat/>
   </w:style>
-  <w:style w:type="paragraph" w:styleId="Heading1">
+  <w:style w:type="paragraph" w:styleId="berschrift1">
     <w:name w:val="heading 1"/>
-    <w:basedOn w:val="Normal"/>
-    <w:next w:val="Normal"/>
-    <w:link w:val="Heading1Char"/>
+    <w:basedOn w:val="Standard"/>
+    <w:next w:val="Standard"/>
+    <w:link w:val="berschrift1Zchn"/>
     <w:uiPriority w:val="9"/>
     <w:qFormat/>
     <w:rsid w:val="002D2047"/>
@@ -1616,11 +1794,11 @@
       <w:szCs w:val="40"/>
     </w:rPr>
   </w:style>
-  <w:style w:type="paragraph" w:styleId="Heading2">
+  <w:style w:type="paragraph" w:styleId="berschrift2">
     <w:name w:val="heading 2"/>
-    <w:basedOn w:val="Normal"/>
-    <w:next w:val="Normal"/>
-    <w:link w:val="Heading2Char"/>
+    <w:basedOn w:val="Standard"/>
+    <w:next w:val="Standard"/>
+    <w:link w:val="berschrift2Zchn"/>
     <w:uiPriority w:val="9"/>
     <w:unhideWhenUsed/>
     <w:qFormat/>
@@ -1638,11 +1816,11 @@
       <w:szCs w:val="32"/>
     </w:rPr>
   </w:style>
-  <w:style w:type="paragraph" w:styleId="Heading3">
+  <w:style w:type="paragraph" w:styleId="berschrift3">
     <w:name w:val="heading 3"/>
-    <w:basedOn w:val="Normal"/>
-    <w:next w:val="Normal"/>
-    <w:link w:val="Heading3Char"/>
+    <w:basedOn w:val="Standard"/>
+    <w:next w:val="Standard"/>
+    <w:link w:val="berschrift3Zchn"/>
     <w:uiPriority w:val="9"/>
     <w:unhideWhenUsed/>
     <w:qFormat/>
@@ -1660,11 +1838,11 @@
       <w:szCs w:val="28"/>
     </w:rPr>
   </w:style>
-  <w:style w:type="paragraph" w:styleId="Heading4">
+  <w:style w:type="paragraph" w:styleId="berschrift4">
     <w:name w:val="heading 4"/>
-    <w:basedOn w:val="Normal"/>
-    <w:next w:val="Normal"/>
-    <w:link w:val="Heading4Char"/>
+    <w:basedOn w:val="Standard"/>
+    <w:next w:val="Standard"/>
+    <w:link w:val="berschrift4Zchn"/>
     <w:uiPriority w:val="9"/>
     <w:semiHidden/>
     <w:unhideWhenUsed/>
@@ -1683,11 +1861,11 @@
       <w:color w:val="2E74B5" w:themeColor="accent1" w:themeShade="BF"/>
     </w:rPr>
   </w:style>
-  <w:style w:type="paragraph" w:styleId="Heading5">
+  <w:style w:type="paragraph" w:styleId="berschrift5">
     <w:name w:val="heading 5"/>
-    <w:basedOn w:val="Normal"/>
-    <w:next w:val="Normal"/>
-    <w:link w:val="Heading5Char"/>
+    <w:basedOn w:val="Standard"/>
+    <w:next w:val="Standard"/>
+    <w:link w:val="berschrift5Zchn"/>
     <w:uiPriority w:val="9"/>
     <w:semiHidden/>
     <w:unhideWhenUsed/>
@@ -1704,11 +1882,11 @@
       <w:color w:val="2E74B5" w:themeColor="accent1" w:themeShade="BF"/>
     </w:rPr>
   </w:style>
-  <w:style w:type="paragraph" w:styleId="Heading6">
+  <w:style w:type="paragraph" w:styleId="berschrift6">
     <w:name w:val="heading 6"/>
-    <w:basedOn w:val="Normal"/>
-    <w:next w:val="Normal"/>
-    <w:link w:val="Heading6Char"/>
+    <w:basedOn w:val="Standard"/>
+    <w:next w:val="Standard"/>
+    <w:link w:val="berschrift6Zchn"/>
     <w:uiPriority w:val="9"/>
     <w:semiHidden/>
     <w:unhideWhenUsed/>
@@ -1727,11 +1905,11 @@
       <w:color w:val="595959" w:themeColor="text1" w:themeTint="A6"/>
     </w:rPr>
   </w:style>
-  <w:style w:type="paragraph" w:styleId="Heading7">
+  <w:style w:type="paragraph" w:styleId="berschrift7">
     <w:name w:val="heading 7"/>
-    <w:basedOn w:val="Normal"/>
-    <w:next w:val="Normal"/>
-    <w:link w:val="Heading7Char"/>
+    <w:basedOn w:val="Standard"/>
+    <w:next w:val="Standard"/>
+    <w:link w:val="berschrift7Zchn"/>
     <w:uiPriority w:val="9"/>
     <w:semiHidden/>
     <w:unhideWhenUsed/>
@@ -1748,11 +1926,11 @@
       <w:color w:val="595959" w:themeColor="text1" w:themeTint="A6"/>
     </w:rPr>
   </w:style>
-  <w:style w:type="paragraph" w:styleId="Heading8">
+  <w:style w:type="paragraph" w:styleId="berschrift8">
     <w:name w:val="heading 8"/>
-    <w:basedOn w:val="Normal"/>
-    <w:next w:val="Normal"/>
-    <w:link w:val="Heading8Char"/>
+    <w:basedOn w:val="Standard"/>
+    <w:next w:val="Standard"/>
+    <w:link w:val="berschrift8Zchn"/>
     <w:uiPriority w:val="9"/>
     <w:semiHidden/>
     <w:unhideWhenUsed/>
@@ -1771,11 +1949,11 @@
       <w:color w:val="272727" w:themeColor="text1" w:themeTint="D8"/>
     </w:rPr>
   </w:style>
-  <w:style w:type="paragraph" w:styleId="Heading9">
+  <w:style w:type="paragraph" w:styleId="berschrift9">
     <w:name w:val="heading 9"/>
-    <w:basedOn w:val="Normal"/>
-    <w:next w:val="Normal"/>
-    <w:link w:val="Heading9Char"/>
+    <w:basedOn w:val="Standard"/>
+    <w:next w:val="Standard"/>
+    <w:link w:val="berschrift9Zchn"/>
     <w:uiPriority w:val="9"/>
     <w:semiHidden/>
     <w:unhideWhenUsed/>
@@ -1792,13 +1970,13 @@
       <w:color w:val="272727" w:themeColor="text1" w:themeTint="D8"/>
     </w:rPr>
   </w:style>
-  <w:style w:type="character" w:default="1" w:styleId="DefaultParagraphFont">
+  <w:style w:type="character" w:default="1" w:styleId="Absatz-Standardschriftart">
     <w:name w:val="Default Paragraph Font"/>
     <w:uiPriority w:val="1"/>
     <w:semiHidden/>
     <w:unhideWhenUsed/>
   </w:style>
-  <w:style w:type="table" w:default="1" w:styleId="TableNormal">
+  <w:style w:type="table" w:default="1" w:styleId="NormaleTabelle">
     <w:name w:val="Normal Table"/>
     <w:uiPriority w:val="99"/>
     <w:semiHidden/>
@@ -1813,16 +1991,16 @@
       </w:tblCellMar>
     </w:tblPr>
   </w:style>
-  <w:style w:type="numbering" w:default="1" w:styleId="NoList">
+  <w:style w:type="numbering" w:default="1" w:styleId="KeineListe">
     <w:name w:val="No List"/>
     <w:uiPriority w:val="99"/>
     <w:semiHidden/>
     <w:unhideWhenUsed/>
   </w:style>
-  <w:style w:type="character" w:customStyle="1" w:styleId="Heading1Char">
-    <w:name w:val="Heading 1 Char"/>
-    <w:basedOn w:val="DefaultParagraphFont"/>
-    <w:link w:val="Heading1"/>
+  <w:style w:type="character" w:customStyle="1" w:styleId="berschrift1Zchn">
+    <w:name w:val="Überschrift 1 Zchn"/>
+    <w:basedOn w:val="Absatz-Standardschriftart"/>
+    <w:link w:val="berschrift1"/>
     <w:uiPriority w:val="9"/>
     <w:rsid w:val="002D2047"/>
     <w:rPr>
@@ -1832,10 +2010,10 @@
       <w:szCs w:val="40"/>
     </w:rPr>
   </w:style>
-  <w:style w:type="character" w:customStyle="1" w:styleId="Heading2Char">
-    <w:name w:val="Heading 2 Char"/>
-    <w:basedOn w:val="DefaultParagraphFont"/>
-    <w:link w:val="Heading2"/>
+  <w:style w:type="character" w:customStyle="1" w:styleId="berschrift2Zchn">
+    <w:name w:val="Überschrift 2 Zchn"/>
+    <w:basedOn w:val="Absatz-Standardschriftart"/>
+    <w:link w:val="berschrift2"/>
     <w:uiPriority w:val="9"/>
     <w:rsid w:val="002D2047"/>
     <w:rPr>
@@ -1845,10 +2023,10 @@
       <w:szCs w:val="32"/>
     </w:rPr>
   </w:style>
-  <w:style w:type="character" w:customStyle="1" w:styleId="Heading3Char">
-    <w:name w:val="Heading 3 Char"/>
-    <w:basedOn w:val="DefaultParagraphFont"/>
-    <w:link w:val="Heading3"/>
+  <w:style w:type="character" w:customStyle="1" w:styleId="berschrift3Zchn">
+    <w:name w:val="Überschrift 3 Zchn"/>
+    <w:basedOn w:val="Absatz-Standardschriftart"/>
+    <w:link w:val="berschrift3"/>
     <w:uiPriority w:val="9"/>
     <w:rsid w:val="002D2047"/>
     <w:rPr>
@@ -1858,10 +2036,10 @@
       <w:szCs w:val="28"/>
     </w:rPr>
   </w:style>
-  <w:style w:type="character" w:customStyle="1" w:styleId="Heading4Char">
-    <w:name w:val="Heading 4 Char"/>
-    <w:basedOn w:val="DefaultParagraphFont"/>
-    <w:link w:val="Heading4"/>
+  <w:style w:type="character" w:customStyle="1" w:styleId="berschrift4Zchn">
+    <w:name w:val="Überschrift 4 Zchn"/>
+    <w:basedOn w:val="Absatz-Standardschriftart"/>
+    <w:link w:val="berschrift4"/>
     <w:uiPriority w:val="9"/>
     <w:semiHidden/>
     <w:rsid w:val="002D2047"/>
@@ -1872,10 +2050,10 @@
       <w:color w:val="2E74B5" w:themeColor="accent1" w:themeShade="BF"/>
     </w:rPr>
   </w:style>
-  <w:style w:type="character" w:customStyle="1" w:styleId="Heading5Char">
-    <w:name w:val="Heading 5 Char"/>
-    <w:basedOn w:val="DefaultParagraphFont"/>
-    <w:link w:val="Heading5"/>
+  <w:style w:type="character" w:customStyle="1" w:styleId="berschrift5Zchn">
+    <w:name w:val="Überschrift 5 Zchn"/>
+    <w:basedOn w:val="Absatz-Standardschriftart"/>
+    <w:link w:val="berschrift5"/>
     <w:uiPriority w:val="9"/>
     <w:semiHidden/>
     <w:rsid w:val="002D2047"/>
@@ -1884,10 +2062,10 @@
       <w:color w:val="2E74B5" w:themeColor="accent1" w:themeShade="BF"/>
     </w:rPr>
   </w:style>
-  <w:style w:type="character" w:customStyle="1" w:styleId="Heading6Char">
-    <w:name w:val="Heading 6 Char"/>
-    <w:basedOn w:val="DefaultParagraphFont"/>
-    <w:link w:val="Heading6"/>
+  <w:style w:type="character" w:customStyle="1" w:styleId="berschrift6Zchn">
+    <w:name w:val="Überschrift 6 Zchn"/>
+    <w:basedOn w:val="Absatz-Standardschriftart"/>
+    <w:link w:val="berschrift6"/>
     <w:uiPriority w:val="9"/>
     <w:semiHidden/>
     <w:rsid w:val="002D2047"/>
@@ -1898,10 +2076,10 @@
       <w:color w:val="595959" w:themeColor="text1" w:themeTint="A6"/>
     </w:rPr>
   </w:style>
-  <w:style w:type="character" w:customStyle="1" w:styleId="Heading7Char">
-    <w:name w:val="Heading 7 Char"/>
-    <w:basedOn w:val="DefaultParagraphFont"/>
-    <w:link w:val="Heading7"/>
+  <w:style w:type="character" w:customStyle="1" w:styleId="berschrift7Zchn">
+    <w:name w:val="Überschrift 7 Zchn"/>
+    <w:basedOn w:val="Absatz-Standardschriftart"/>
+    <w:link w:val="berschrift7"/>
     <w:uiPriority w:val="9"/>
     <w:semiHidden/>
     <w:rsid w:val="002D2047"/>
@@ -1910,10 +2088,10 @@
       <w:color w:val="595959" w:themeColor="text1" w:themeTint="A6"/>
     </w:rPr>
   </w:style>
-  <w:style w:type="character" w:customStyle="1" w:styleId="Heading8Char">
-    <w:name w:val="Heading 8 Char"/>
-    <w:basedOn w:val="DefaultParagraphFont"/>
-    <w:link w:val="Heading8"/>
+  <w:style w:type="character" w:customStyle="1" w:styleId="berschrift8Zchn">
+    <w:name w:val="Überschrift 8 Zchn"/>
+    <w:basedOn w:val="Absatz-Standardschriftart"/>
+    <w:link w:val="berschrift8"/>
     <w:uiPriority w:val="9"/>
     <w:semiHidden/>
     <w:rsid w:val="002D2047"/>
@@ -1924,10 +2102,10 @@
       <w:color w:val="272727" w:themeColor="text1" w:themeTint="D8"/>
     </w:rPr>
   </w:style>
-  <w:style w:type="character" w:customStyle="1" w:styleId="Heading9Char">
-    <w:name w:val="Heading 9 Char"/>
-    <w:basedOn w:val="DefaultParagraphFont"/>
-    <w:link w:val="Heading9"/>
+  <w:style w:type="character" w:customStyle="1" w:styleId="berschrift9Zchn">
+    <w:name w:val="Überschrift 9 Zchn"/>
+    <w:basedOn w:val="Absatz-Standardschriftart"/>
+    <w:link w:val="berschrift9"/>
     <w:uiPriority w:val="9"/>
     <w:semiHidden/>
     <w:rsid w:val="002D2047"/>
@@ -1936,11 +2114,11 @@
       <w:color w:val="272727" w:themeColor="text1" w:themeTint="D8"/>
     </w:rPr>
   </w:style>
-  <w:style w:type="paragraph" w:styleId="Title">
+  <w:style w:type="paragraph" w:styleId="Titel">
     <w:name w:val="Title"/>
-    <w:basedOn w:val="Normal"/>
-    <w:next w:val="Normal"/>
-    <w:link w:val="TitleChar"/>
+    <w:basedOn w:val="Standard"/>
+    <w:next w:val="Standard"/>
+    <w:link w:val="TitelZchn"/>
     <w:uiPriority w:val="10"/>
     <w:qFormat/>
     <w:rsid w:val="002D2047"/>
@@ -1956,10 +2134,10 @@
       <w:szCs w:val="56"/>
     </w:rPr>
   </w:style>
-  <w:style w:type="character" w:customStyle="1" w:styleId="TitleChar">
-    <w:name w:val="Title Char"/>
-    <w:basedOn w:val="DefaultParagraphFont"/>
-    <w:link w:val="Title"/>
+  <w:style w:type="character" w:customStyle="1" w:styleId="TitelZchn">
+    <w:name w:val="Titel Zchn"/>
+    <w:basedOn w:val="Absatz-Standardschriftart"/>
+    <w:link w:val="Titel"/>
     <w:uiPriority w:val="10"/>
     <w:rsid w:val="002D2047"/>
     <w:rPr>
@@ -1970,11 +2148,11 @@
       <w:szCs w:val="56"/>
     </w:rPr>
   </w:style>
-  <w:style w:type="paragraph" w:styleId="Subtitle">
+  <w:style w:type="paragraph" w:styleId="Untertitel">
     <w:name w:val="Subtitle"/>
-    <w:basedOn w:val="Normal"/>
-    <w:next w:val="Normal"/>
-    <w:link w:val="SubtitleChar"/>
+    <w:basedOn w:val="Standard"/>
+    <w:next w:val="Standard"/>
+    <w:link w:val="UntertitelZchn"/>
     <w:uiPriority w:val="11"/>
     <w:qFormat/>
     <w:rsid w:val="002D2047"/>
@@ -1991,10 +2169,10 @@
       <w:szCs w:val="28"/>
     </w:rPr>
   </w:style>
-  <w:style w:type="character" w:customStyle="1" w:styleId="SubtitleChar">
-    <w:name w:val="Subtitle Char"/>
-    <w:basedOn w:val="DefaultParagraphFont"/>
-    <w:link w:val="Subtitle"/>
+  <w:style w:type="character" w:customStyle="1" w:styleId="UntertitelZchn">
+    <w:name w:val="Untertitel Zchn"/>
+    <w:basedOn w:val="Absatz-Standardschriftart"/>
+    <w:link w:val="Untertitel"/>
     <w:uiPriority w:val="11"/>
     <w:rsid w:val="002D2047"/>
     <w:rPr>
@@ -2005,11 +2183,11 @@
       <w:szCs w:val="28"/>
     </w:rPr>
   </w:style>
-  <w:style w:type="paragraph" w:styleId="Quote">
+  <w:style w:type="paragraph" w:styleId="Zitat">
     <w:name w:val="Quote"/>
-    <w:basedOn w:val="Normal"/>
-    <w:next w:val="Normal"/>
-    <w:link w:val="QuoteChar"/>
+    <w:basedOn w:val="Standard"/>
+    <w:next w:val="Standard"/>
+    <w:link w:val="ZitatZchn"/>
     <w:uiPriority w:val="29"/>
     <w:qFormat/>
     <w:rsid w:val="002D2047"/>
@@ -2023,10 +2201,10 @@
       <w:color w:val="404040" w:themeColor="text1" w:themeTint="BF"/>
     </w:rPr>
   </w:style>
-  <w:style w:type="character" w:customStyle="1" w:styleId="QuoteChar">
-    <w:name w:val="Quote Char"/>
-    <w:basedOn w:val="DefaultParagraphFont"/>
-    <w:link w:val="Quote"/>
+  <w:style w:type="character" w:customStyle="1" w:styleId="ZitatZchn">
+    <w:name w:val="Zitat Zchn"/>
+    <w:basedOn w:val="Absatz-Standardschriftart"/>
+    <w:link w:val="Zitat"/>
     <w:uiPriority w:val="29"/>
     <w:rsid w:val="002D2047"/>
     <w:rPr>
@@ -2035,9 +2213,9 @@
       <w:color w:val="404040" w:themeColor="text1" w:themeTint="BF"/>
     </w:rPr>
   </w:style>
-  <w:style w:type="paragraph" w:styleId="ListParagraph">
+  <w:style w:type="paragraph" w:styleId="Listenabsatz">
     <w:name w:val="List Paragraph"/>
-    <w:basedOn w:val="Normal"/>
+    <w:basedOn w:val="Standard"/>
     <w:uiPriority w:val="34"/>
     <w:qFormat/>
     <w:rsid w:val="002D2047"/>
@@ -2046,9 +2224,9 @@
       <w:contextualSpacing/>
     </w:pPr>
   </w:style>
-  <w:style w:type="character" w:styleId="IntenseEmphasis">
+  <w:style w:type="character" w:styleId="IntensiveHervorhebung">
     <w:name w:val="Intense Emphasis"/>
-    <w:basedOn w:val="DefaultParagraphFont"/>
+    <w:basedOn w:val="Absatz-Standardschriftart"/>
     <w:uiPriority w:val="21"/>
     <w:qFormat/>
     <w:rsid w:val="002D2047"/>
@@ -2058,11 +2236,11 @@
       <w:color w:val="2E74B5" w:themeColor="accent1" w:themeShade="BF"/>
     </w:rPr>
   </w:style>
-  <w:style w:type="paragraph" w:styleId="IntenseQuote">
+  <w:style w:type="paragraph" w:styleId="IntensivesZitat">
     <w:name w:val="Intense Quote"/>
-    <w:basedOn w:val="Normal"/>
-    <w:next w:val="Normal"/>
-    <w:link w:val="IntenseQuoteChar"/>
+    <w:basedOn w:val="Standard"/>
+    <w:next w:val="Standard"/>
+    <w:link w:val="IntensivesZitatZchn"/>
     <w:uiPriority w:val="30"/>
     <w:qFormat/>
     <w:rsid w:val="002D2047"/>
@@ -2081,10 +2259,10 @@
       <w:color w:val="2E74B5" w:themeColor="accent1" w:themeShade="BF"/>
     </w:rPr>
   </w:style>
-  <w:style w:type="character" w:customStyle="1" w:styleId="IntenseQuoteChar">
-    <w:name w:val="Intense Quote Char"/>
-    <w:basedOn w:val="DefaultParagraphFont"/>
-    <w:link w:val="IntenseQuote"/>
+  <w:style w:type="character" w:customStyle="1" w:styleId="IntensivesZitatZchn">
+    <w:name w:val="Intensives Zitat Zchn"/>
+    <w:basedOn w:val="Absatz-Standardschriftart"/>
+    <w:link w:val="IntensivesZitat"/>
     <w:uiPriority w:val="30"/>
     <w:rsid w:val="002D2047"/>
     <w:rPr>
@@ -2093,9 +2271,9 @@
       <w:color w:val="2E74B5" w:themeColor="accent1" w:themeShade="BF"/>
     </w:rPr>
   </w:style>
-  <w:style w:type="character" w:styleId="IntenseReference">
+  <w:style w:type="character" w:styleId="IntensiverVerweis">
     <w:name w:val="Intense Reference"/>
-    <w:basedOn w:val="DefaultParagraphFont"/>
+    <w:basedOn w:val="Absatz-Standardschriftart"/>
     <w:uiPriority w:val="32"/>
     <w:qFormat/>
     <w:rsid w:val="002D2047"/>

</xml_diff>